<commit_message>
Notes on revisions for finrisk
</commit_message>
<xml_diff>
--- a/Riskiness Index/Riskiness-Finances.docx
+++ b/Riskiness Index/Riskiness-Finances.docx
@@ -814,132 +814,9 @@
       <w:r>
         <w:t xml:space="preserve">Stocks and precious metals can be sold quickly but the risk with them is being forced to sell at a loss during a downturn. </w:t>
       </w:r>
-      <w:r>
-        <w:t>Common to all insurers is changes to interest rates which could affect long-dated life and pension plans. Since every holding is Canadian</w:t>
-      </w:r>
-      <w:r>
-        <w:t xml:space="preserve">, </w:t>
-      </w:r>
-      <w:r>
-        <w:t xml:space="preserve">any regional or national dip will hit both assets and claims at the same time. </w:t>
-      </w:r>
-    </w:p>
-    <w:p>
-      <w:r>
-        <w:t xml:space="preserve">We are also concerned about where funds are dedicated. </w:t>
-      </w:r>
-      <w:r>
-        <w:t xml:space="preserve">Cyber is </w:t>
-      </w:r>
-      <w:r>
-        <w:t xml:space="preserve">listed as </w:t>
-      </w:r>
-      <w:r>
-        <w:t xml:space="preserve">one of the main risks </w:t>
-      </w:r>
-      <w:r>
-        <w:t xml:space="preserve">the company plans to mitigate against yet has no dedicated cyber-security staff. The current assessment is that </w:t>
-      </w:r>
-      <w:r>
-        <w:t>resources appear disproportionately distributed to the risks they company is concerned with</w:t>
-      </w:r>
-      <w:r>
-        <w:t xml:space="preserve">. Paired with the asset mix and liquidity risk, the company, in its current position and standing, will be vulnerable to a pandemic economy. </w:t>
-      </w:r>
-    </w:p>
-    <w:p/>
-    <w:p>
-      <w:pPr>
-        <w:pStyle w:val="Heading2"/>
-      </w:pPr>
-      <w:r>
-        <w:t>On the Internal Controls</w:t>
-      </w:r>
-    </w:p>
-    <w:p>
-      <w:r>
-        <w:t xml:space="preserve">ItrustU </w:t>
-      </w:r>
-      <w:r>
-        <w:t xml:space="preserve">currently collects all premiums, processes claims </w:t>
-      </w:r>
-      <w:r>
-        <w:t xml:space="preserve">and </w:t>
-      </w:r>
-      <w:r>
-        <w:t xml:space="preserve">quotes through their website, mobile app and internal systems. This means they are vulnerable to every cyber security vulnerability in the book: direct theft through fraudulent claims payouts and payroll diversion; ransom and recovery costs; data loss and </w:t>
-      </w:r>
-      <w:r>
-        <w:t xml:space="preserve">its </w:t>
-      </w:r>
-      <w:r>
-        <w:t>legal costs; regulatory penalties</w:t>
-      </w:r>
-      <w:r>
-        <w:t>; a tech outage would stop premiums collection and claims payment at the same time.</w:t>
-      </w:r>
-      <w:r>
-        <w:t xml:space="preserve"> </w:t>
-      </w:r>
-      <w:r>
-        <w:t>Six people currently cover IT and networking for 50 desktops, on-site servers and the internal network. Hosting, backups and security advice are outsourced. A six person team likely cannot provide round-the-clock monitoring</w:t>
-      </w:r>
-      <w:r>
-        <w:t xml:space="preserve">. </w:t>
-      </w:r>
-      <w:r>
-        <w:t xml:space="preserve">Control therefore depends on vendors the company does not directly manage. </w:t>
-      </w:r>
-      <w:r>
-        <w:t xml:space="preserve">The switch to remote work during a pandemic increases the chances for attack and decreases the strength of defending it. </w:t>
-      </w:r>
-      <w:r>
-        <w:t>Also,</w:t>
-      </w:r>
-      <w:r>
-        <w:t xml:space="preserve"> during a pandemic, brokers and bank partners </w:t>
-      </w:r>
-      <w:r>
-        <w:t>could</w:t>
-      </w:r>
-      <w:r>
-        <w:t xml:space="preserve"> delay or not remit premiums altogether, reinsurers will </w:t>
-      </w:r>
-      <w:r>
-        <w:t xml:space="preserve">likely </w:t>
-      </w:r>
-      <w:r>
-        <w:t xml:space="preserve">not be in a position to pay recoveries and </w:t>
-      </w:r>
-      <w:r>
-        <w:t xml:space="preserve">bond issuers may default on any </w:t>
-      </w:r>
-      <w:r>
-        <w:t>dividends they expect</w:t>
-      </w:r>
-      <w:r>
-        <w:t>ed</w:t>
-      </w:r>
-      <w:r>
-        <w:t xml:space="preserve"> to receive. </w:t>
-      </w:r>
-    </w:p>
-    <w:p/>
-    <w:p>
-      <w:pPr>
-        <w:pStyle w:val="Heading2"/>
-      </w:pPr>
-      <w:r>
-        <w:t>On Liabilities Under Control</w:t>
-      </w:r>
-    </w:p>
-    <w:p>
-      <w:r>
-        <w:t xml:space="preserve">ItrustU writes both Property &amp; Casualty (P&amp;C) and life/pension products. In the industry, reserves are typically the largest liability on the balance sheet. </w:t>
-      </w:r>
       <w:commentRangeStart w:id="0"/>
       <w:r>
-        <w:t>With one in three Ontario households insured, adverse weather conditions like ice storms or floods will affect a large share of the clients at once</w:t>
+        <w:t xml:space="preserve">Common to all insurers is changes to interest rates </w:t>
       </w:r>
       <w:commentRangeEnd w:id="0"/>
       <w:r>
@@ -951,6 +828,184 @@
         <w:commentReference w:id="0"/>
       </w:r>
       <w:r>
+        <w:t>which could affect long-dated life and pension plans. Since every holding is Canadian</w:t>
+      </w:r>
+      <w:r>
+        <w:t xml:space="preserve">, </w:t>
+      </w:r>
+      <w:r>
+        <w:t xml:space="preserve">any regional or national dip will hit both assets and claims at the same time. </w:t>
+      </w:r>
+    </w:p>
+    <w:p>
+      <w:r>
+        <w:t xml:space="preserve">We are also concerned about where funds are dedicated. </w:t>
+      </w:r>
+      <w:r>
+        <w:t xml:space="preserve">Cyber is </w:t>
+      </w:r>
+      <w:r>
+        <w:t xml:space="preserve">listed as </w:t>
+      </w:r>
+      <w:r>
+        <w:t xml:space="preserve">one of the main risks </w:t>
+      </w:r>
+      <w:r>
+        <w:t xml:space="preserve">the company plans to mitigate against yet has no dedicated cyber-security staff. The current assessment is that </w:t>
+      </w:r>
+      <w:r>
+        <w:t>resources appear disproportionately distributed to the risks they company is concerned with</w:t>
+      </w:r>
+      <w:r>
+        <w:t xml:space="preserve">. Paired with the asset mix and liquidity risk, the company, in its current position and standing, will be vulnerable to a pandemic economy. </w:t>
+      </w:r>
+    </w:p>
+    <w:p/>
+    <w:p>
+      <w:pPr>
+        <w:pStyle w:val="Heading2"/>
+      </w:pPr>
+      <w:r>
+        <w:t>On the Internal Controls</w:t>
+      </w:r>
+    </w:p>
+    <w:p>
+      <w:r>
+        <w:t xml:space="preserve">ItrustU </w:t>
+      </w:r>
+      <w:r>
+        <w:t xml:space="preserve">currently collects all premiums, processes claims </w:t>
+      </w:r>
+      <w:r>
+        <w:t xml:space="preserve">and </w:t>
+      </w:r>
+      <w:r>
+        <w:t xml:space="preserve">quotes through their website, mobile app and internal systems. </w:t>
+      </w:r>
+      <w:commentRangeStart w:id="1"/>
+      <w:r>
+        <w:t>This means they are vulnerable to every cyber security vulnerability in the book</w:t>
+      </w:r>
+      <w:commentRangeEnd w:id="1"/>
+      <w:r>
+        <w:rPr>
+          <w:rStyle w:val="CommentReference"/>
+          <w:sz w:val="24"/>
+          <w:szCs w:val="22"/>
+        </w:rPr>
+        <w:commentReference w:id="1"/>
+      </w:r>
+      <w:r>
+        <w:t xml:space="preserve">: direct theft through fraudulent claims payouts and payroll diversion; </w:t>
+      </w:r>
+      <w:commentRangeStart w:id="2"/>
+      <w:r>
+        <w:t xml:space="preserve">ransom </w:t>
+      </w:r>
+      <w:commentRangeEnd w:id="2"/>
+      <w:r>
+        <w:rPr>
+          <w:rStyle w:val="CommentReference"/>
+          <w:sz w:val="24"/>
+          <w:szCs w:val="22"/>
+        </w:rPr>
+        <w:commentReference w:id="2"/>
+      </w:r>
+      <w:r>
+        <w:t xml:space="preserve">and recovery costs; data loss and </w:t>
+      </w:r>
+      <w:r>
+        <w:t xml:space="preserve">its </w:t>
+      </w:r>
+      <w:r>
+        <w:t>legal costs; regulatory penalties</w:t>
+      </w:r>
+      <w:r>
+        <w:t>; a tech outage would stop premiums collection and claims payment at the same time.</w:t>
+      </w:r>
+      <w:r>
+        <w:t xml:space="preserve"> </w:t>
+      </w:r>
+      <w:r>
+        <w:t>Six people currently cover IT and networking for 50 desktops, on-site servers and the internal network. Hosting, backups and security advice are outsourced. A six person team likely cannot provide round-the-clock monitoring</w:t>
+      </w:r>
+      <w:r>
+        <w:t xml:space="preserve">. </w:t>
+      </w:r>
+      <w:r>
+        <w:t xml:space="preserve">Control therefore depends on vendors the company does not directly manage. </w:t>
+      </w:r>
+      <w:r>
+        <w:t xml:space="preserve">The switch to remote work during a pandemic increases the chances for attack and decreases the strength of defending it. </w:t>
+      </w:r>
+      <w:r>
+        <w:t>Also,</w:t>
+      </w:r>
+      <w:r>
+        <w:t xml:space="preserve"> during a pandemic, brokers and bank partners </w:t>
+      </w:r>
+      <w:r>
+        <w:t>could</w:t>
+      </w:r>
+      <w:r>
+        <w:t xml:space="preserve"> delay or not remit premiums altogether, reinsurers will </w:t>
+      </w:r>
+      <w:r>
+        <w:t xml:space="preserve">likely </w:t>
+      </w:r>
+      <w:r>
+        <w:t xml:space="preserve">not be in a position to pay recoveries and </w:t>
+      </w:r>
+      <w:r>
+        <w:t xml:space="preserve">bond issuers may default on any </w:t>
+      </w:r>
+      <w:r>
+        <w:t>dividends they expect</w:t>
+      </w:r>
+      <w:r>
+        <w:t>ed</w:t>
+      </w:r>
+      <w:r>
+        <w:t xml:space="preserve"> to receive. </w:t>
+      </w:r>
+    </w:p>
+    <w:p/>
+    <w:p>
+      <w:pPr>
+        <w:pStyle w:val="Heading2"/>
+      </w:pPr>
+      <w:r>
+        <w:t>On Liabilities Under Control</w:t>
+      </w:r>
+    </w:p>
+    <w:p>
+      <w:r>
+        <w:t xml:space="preserve">ItrustU writes both Property &amp; Casualty (P&amp;C) and life/pension products. In the industry, reserves are typically the largest liability on the balance sheet. </w:t>
+      </w:r>
+      <w:commentRangeStart w:id="3"/>
+      <w:commentRangeStart w:id="4"/>
+      <w:r>
+        <w:t>With one in three Ontario households insured, adverse weather conditions like ice storms or floods will affect a large share of the clients at once</w:t>
+      </w:r>
+      <w:commentRangeEnd w:id="3"/>
+      <w:r>
+        <w:rPr>
+          <w:rStyle w:val="CommentReference"/>
+          <w:sz w:val="24"/>
+          <w:szCs w:val="22"/>
+        </w:rPr>
+        <w:commentReference w:id="3"/>
+      </w:r>
+      <w:commentRangeEnd w:id="4"/>
+      <w:r>
+        <w:rPr>
+          <w:rStyle w:val="CommentReference"/>
+          <w:sz w:val="24"/>
+          <w:szCs w:val="22"/>
+        </w:rPr>
+        <w:commentReference w:id="4"/>
+      </w:r>
+      <w:r>
         <w:t xml:space="preserve">. </w:t>
       </w:r>
       <w:r>
@@ -1004,6 +1059,7 @@
       <w:r>
         <w:t xml:space="preserve">Liabilities can result in the most losses overall as rising claims and a fall in interest rates can significantly strain reserves. The lack of infrastructure in these areas suggest that further investment in people, systems and vendor oversight would reduce financial exposure as well. </w:t>
       </w:r>
+      <w:commentRangeStart w:id="5"/>
       <w:r>
         <w:t>Does that mean that we could only reduce as much risk as our financ</w:t>
       </w:r>
@@ -1015,6 +1071,15 @@
       </w:r>
       <w:r>
         <w:t>??</w:t>
+      </w:r>
+      <w:commentRangeEnd w:id="5"/>
+      <w:r>
+        <w:rPr>
+          <w:rStyle w:val="CommentReference"/>
+          <w:sz w:val="24"/>
+          <w:szCs w:val="22"/>
+        </w:rPr>
+        <w:commentReference w:id="5"/>
       </w:r>
     </w:p>
     <w:p/>
@@ -1067,7 +1132,7 @@
 
 <file path=word/comments.xml><?xml version="1.0" encoding="utf-8"?>
 <w:comments xmlns:wpc="http://schemas.microsoft.com/office/word/2010/wordprocessingCanvas" xmlns:cx="http://schemas.microsoft.com/office/drawing/2014/chartex" xmlns:cx1="http://schemas.microsoft.com/office/drawing/2015/9/8/chartex" xmlns:cx2="http://schemas.microsoft.com/office/drawing/2015/10/21/chartex" xmlns:cx3="http://schemas.microsoft.com/office/drawing/2016/5/9/chartex" xmlns:cx4="http://schemas.microsoft.com/office/drawing/2016/5/10/chartex" xmlns:cx5="http://schemas.microsoft.com/office/drawing/2016/5/11/chartex" xmlns:cx6="http://schemas.microsoft.com/office/drawing/2016/5/12/chartex" xmlns:cx7="http://schemas.microsoft.com/office/drawing/2016/5/13/chartex" xmlns:cx8="http://schemas.microsoft.com/office/drawing/2016/5/14/chartex" xmlns:mc="http://schemas.openxmlformats.org/markup-compatibility/2006" xmlns:aink="http://schemas.microsoft.com/office/drawing/2016/ink" xmlns:am3d="http://schemas.microsoft.com/office/drawing/2017/model3d" xmlns:o="urn:schemas-microsoft-com:office:office" xmlns:oel="http://schemas.microsoft.com/office/2019/extlst" xmlns:r="http://schemas.openxmlformats.org/officeDocument/2006/relationships" xmlns:m="http://schemas.openxmlformats.org/officeDocument/2006/math" xmlns:v="urn:schemas-microsoft-com:vml" xmlns:wp14="http://schemas.microsoft.com/office/word/2010/wordprocessingDrawing" xmlns:wp="http://schemas.openxmlformats.org/drawingml/2006/wordprocessingDrawing" xmlns:w10="urn:schemas-microsoft-com:office:word" xmlns:w="http://schemas.openxmlformats.org/wordprocessingml/2006/main" xmlns:w14="http://schemas.microsoft.com/office/word/2010/wordml" xmlns:w15="http://schemas.microsoft.com/office/word/2012/wordml" xmlns:w16cex="http://schemas.microsoft.com/office/word/2018/wordml/cex" xmlns:w16cid="http://schemas.microsoft.com/office/word/2016/wordml/cid" xmlns:w16="http://schemas.microsoft.com/office/word/2018/wordml" xmlns:w16du="http://schemas.microsoft.com/office/word/2023/wordml/word16du" xmlns:w16sdtdh="http://schemas.microsoft.com/office/word/2020/wordml/sdtdatahash" xmlns:w16sdtfl="http://schemas.microsoft.com/office/word/2024/wordml/sdtformatlock" xmlns:w16se="http://schemas.microsoft.com/office/word/2015/wordml/symex" xmlns:wpg="http://schemas.microsoft.com/office/word/2010/wordprocessingGroup" xmlns:wpi="http://schemas.microsoft.com/office/word/2010/wordprocessingInk" xmlns:wne="http://schemas.microsoft.com/office/word/2006/wordml" xmlns:wps="http://schemas.microsoft.com/office/word/2010/wordprocessingShape" mc:Ignorable="w14 w15 w16se w16cid w16 w16cex w16sdtdh w16sdtfl w16du wp14">
-  <w:comment w:id="0" w:author="Nathan Brasse" w:date="2026-09-29T16:00:00Z" w:initials="NB">
+  <w:comment w:id="0" w:author="Chris Haritun" w:date="2026-09-29T19:34:00Z" w:initials="CH">
     <w:p>
       <w:pPr>
         <w:pStyle w:val="CommentText"/>
@@ -1079,7 +1144,94 @@
         <w:annotationRef/>
       </w:r>
       <w:r>
+        <w:t xml:space="preserve">Can this be altered? The fear entering the pandemic was that shutting down businesses would create a recessing which generally sparks a decline in interest rates to drive investment. </w:t>
+      </w:r>
+    </w:p>
+  </w:comment>
+  <w:comment w:id="1" w:author="Chris Haritun" w:date="2026-09-29T19:35:00Z" w:initials="CH">
+    <w:p>
+      <w:pPr>
+        <w:pStyle w:val="CommentText"/>
+      </w:pPr>
+      <w:r>
+        <w:rPr>
+          <w:rStyle w:val="CommentReference"/>
+        </w:rPr>
+        <w:annotationRef/>
+      </w:r>
+      <w:r>
+        <w:t xml:space="preserve">Language is too informal. </w:t>
+      </w:r>
+    </w:p>
+  </w:comment>
+  <w:comment w:id="2" w:author="Chris Haritun" w:date="2026-09-29T19:35:00Z" w:initials="CH">
+    <w:p>
+      <w:pPr>
+        <w:pStyle w:val="CommentText"/>
+      </w:pPr>
+      <w:r>
+        <w:rPr>
+          <w:rStyle w:val="CommentReference"/>
+        </w:rPr>
+        <w:annotationRef/>
+      </w:r>
+      <w:r>
+        <w:t>ransomware</w:t>
+      </w:r>
+    </w:p>
+  </w:comment>
+  <w:comment w:id="3" w:author="Nathan Brasse" w:date="2026-09-29T16:00:00Z" w:initials="NB">
+    <w:p>
+      <w:pPr>
+        <w:pStyle w:val="CommentText"/>
+      </w:pPr>
+      <w:r>
+        <w:rPr>
+          <w:rStyle w:val="CommentReference"/>
+        </w:rPr>
+        <w:annotationRef/>
+      </w:r>
+      <w:r>
         <w:t>How many homes are in Ontario?</w:t>
+      </w:r>
+    </w:p>
+  </w:comment>
+  <w:comment w:id="4" w:author="Chris Haritun" w:date="2026-09-29T19:36:00Z" w:initials="CH">
+    <w:p>
+      <w:pPr>
+        <w:pStyle w:val="CommentText"/>
+      </w:pPr>
+      <w:r>
+        <w:rPr>
+          <w:rStyle w:val="CommentReference"/>
+        </w:rPr>
+        <w:annotationRef/>
+      </w:r>
+      <w:r>
+        <w:t>5.8 million</w:t>
+      </w:r>
+    </w:p>
+  </w:comment>
+  <w:comment w:id="5" w:author="Chris Haritun" w:date="2026-09-29T19:38:00Z" w:initials="CH">
+    <w:p>
+      <w:pPr>
+        <w:pStyle w:val="CommentText"/>
+      </w:pPr>
+      <w:r>
+        <w:rPr>
+          <w:rStyle w:val="CommentReference"/>
+        </w:rPr>
+        <w:annotationRef/>
+      </w:r>
+      <w:r>
+        <w:t xml:space="preserve">I would change this. </w:t>
+      </w:r>
+      <w:r>
+        <w:br/>
+      </w:r>
+      <w:r>
+        <w:br/>
+        <w:t xml:space="preserve">Talk about how our risk strategy needs to be developed based on available funds. We will need to carefully measure which risk warrant treatment or termination, and which we will be required to tolerate. </w:t>
       </w:r>
     </w:p>
   </w:comment>
@@ -1088,19 +1240,34 @@
 
 <file path=word/commentsExtended.xml><?xml version="1.0" encoding="utf-8"?>
 <w15:commentsEx xmlns:wpc="http://schemas.microsoft.com/office/word/2010/wordprocessingCanvas" xmlns:cx="http://schemas.microsoft.com/office/drawing/2014/chartex" xmlns:cx1="http://schemas.microsoft.com/office/drawing/2015/9/8/chartex" xmlns:cx2="http://schemas.microsoft.com/office/drawing/2015/10/21/chartex" xmlns:cx3="http://schemas.microsoft.com/office/drawing/2016/5/9/chartex" xmlns:cx4="http://schemas.microsoft.com/office/drawing/2016/5/10/chartex" xmlns:cx5="http://schemas.microsoft.com/office/drawing/2016/5/11/chartex" xmlns:cx6="http://schemas.microsoft.com/office/drawing/2016/5/12/chartex" xmlns:cx7="http://schemas.microsoft.com/office/drawing/2016/5/13/chartex" xmlns:cx8="http://schemas.microsoft.com/office/drawing/2016/5/14/chartex" xmlns:mc="http://schemas.openxmlformats.org/markup-compatibility/2006" xmlns:aink="http://schemas.microsoft.com/office/drawing/2016/ink" xmlns:am3d="http://schemas.microsoft.com/office/drawing/2017/model3d" xmlns:o="urn:schemas-microsoft-com:office:office" xmlns:oel="http://schemas.microsoft.com/office/2019/extlst" xmlns:r="http://schemas.openxmlformats.org/officeDocument/2006/relationships" xmlns:m="http://schemas.openxmlformats.org/officeDocument/2006/math" xmlns:v="urn:schemas-microsoft-com:vml" xmlns:wp14="http://schemas.microsoft.com/office/word/2010/wordprocessingDrawing" xmlns:wp="http://schemas.openxmlformats.org/drawingml/2006/wordprocessingDrawing" xmlns:w10="urn:schemas-microsoft-com:office:word" xmlns:w="http://schemas.openxmlformats.org/wordprocessingml/2006/main" xmlns:w14="http://schemas.microsoft.com/office/word/2010/wordml" xmlns:w15="http://schemas.microsoft.com/office/word/2012/wordml" xmlns:w16cex="http://schemas.microsoft.com/office/word/2018/wordml/cex" xmlns:w16cid="http://schemas.microsoft.com/office/word/2016/wordml/cid" xmlns:w16="http://schemas.microsoft.com/office/word/2018/wordml" xmlns:w16du="http://schemas.microsoft.com/office/word/2023/wordml/word16du" xmlns:w16sdtdh="http://schemas.microsoft.com/office/word/2020/wordml/sdtdatahash" xmlns:w16sdtfl="http://schemas.microsoft.com/office/word/2024/wordml/sdtformatlock" xmlns:w16se="http://schemas.microsoft.com/office/word/2015/wordml/symex" xmlns:wpg="http://schemas.microsoft.com/office/word/2010/wordprocessingGroup" xmlns:wpi="http://schemas.microsoft.com/office/word/2010/wordprocessingInk" xmlns:wne="http://schemas.microsoft.com/office/word/2006/wordml" xmlns:wps="http://schemas.microsoft.com/office/word/2010/wordprocessingShape" mc:Ignorable="w14 w15 w16se w16cid w16 w16cex w16sdtdh w16sdtfl w16du wp14">
+  <w15:commentEx w15:paraId="5368AF56" w15:done="0"/>
+  <w15:commentEx w15:paraId="1B48BC87" w15:done="0"/>
+  <w15:commentEx w15:paraId="0B82BE84" w15:done="0"/>
   <w15:commentEx w15:paraId="7808B866" w15:done="0"/>
+  <w15:commentEx w15:paraId="2FC194F8" w15:paraIdParent="7808B866" w15:done="0"/>
+  <w15:commentEx w15:paraId="09AD0B83" w15:done="0"/>
 </w15:commentsEx>
 </file>
 
 <file path=word/commentsExtensible.xml><?xml version="1.0" encoding="utf-8"?>
 <w16cex:commentsExtensible xmlns:wpc="http://schemas.microsoft.com/office/word/2010/wordprocessingCanvas" xmlns:cx="http://schemas.microsoft.com/office/drawing/2014/chartex" xmlns:cx1="http://schemas.microsoft.com/office/drawing/2015/9/8/chartex" xmlns:cx2="http://schemas.microsoft.com/office/drawing/2015/10/21/chartex" xmlns:cx3="http://schemas.microsoft.com/office/drawing/2016/5/9/chartex" xmlns:cx4="http://schemas.microsoft.com/office/drawing/2016/5/10/chartex" xmlns:cx5="http://schemas.microsoft.com/office/drawing/2016/5/11/chartex" xmlns:cx6="http://schemas.microsoft.com/office/drawing/2016/5/12/chartex" xmlns:cx7="http://schemas.microsoft.com/office/drawing/2016/5/13/chartex" xmlns:cx8="http://schemas.microsoft.com/office/drawing/2016/5/14/chartex" xmlns:cr="http://schemas.microsoft.com/office/comments/2020/reactions" xmlns:mc="http://schemas.openxmlformats.org/markup-compatibility/2006" xmlns:aink="http://schemas.microsoft.com/office/drawing/2016/ink" xmlns:am3d="http://schemas.microsoft.com/office/drawing/2017/model3d" xmlns:o="urn:schemas-microsoft-com:office:office" xmlns:oel="http://schemas.microsoft.com/office/2019/extlst" xmlns:r="http://schemas.openxmlformats.org/officeDocument/2006/relationships" xmlns:m="http://schemas.openxmlformats.org/officeDocument/2006/math" xmlns:v="urn:schemas-microsoft-com:vml" xmlns:wp14="http://schemas.microsoft.com/office/word/2010/wordprocessingDrawing" xmlns:wp="http://schemas.openxmlformats.org/drawingml/2006/wordprocessingDrawing" xmlns:w10="urn:schemas-microsoft-com:office:word" xmlns:w="http://schemas.openxmlformats.org/wordprocessingml/2006/main" xmlns:w14="http://schemas.microsoft.com/office/word/2010/wordml" xmlns:w15="http://schemas.microsoft.com/office/word/2012/wordml" xmlns:w16cex="http://schemas.microsoft.com/office/word/2018/wordml/cex" xmlns:w16cid="http://schemas.microsoft.com/office/word/2016/wordml/cid" xmlns:w16="http://schemas.microsoft.com/office/word/2018/wordml" xmlns:w16du="http://schemas.microsoft.com/office/word/2023/wordml/word16du" xmlns:w16sdtdh="http://schemas.microsoft.com/office/word/2020/wordml/sdtdatahash" xmlns:w16sdtfl="http://schemas.microsoft.com/office/word/2024/wordml/sdtformatlock" xmlns:w16se="http://schemas.microsoft.com/office/word/2015/wordml/symex" xmlns:wpg="http://schemas.microsoft.com/office/word/2010/wordprocessingGroup" xmlns:wpi="http://schemas.microsoft.com/office/word/2010/wordprocessingInk" xmlns:wne="http://schemas.microsoft.com/office/word/2006/wordml" xmlns:wps="http://schemas.microsoft.com/office/word/2010/wordprocessingShape" mc:Ignorable="w14 w15 w16se w16cid w16 w16cex w16sdtdh w16sdtfl cr w16du wp14">
+  <w16cex:commentExtensible w16cex:durableId="27AA91E2" w16cex:dateUtc="2026-09-29T23:34:00Z"/>
+  <w16cex:commentExtensible w16cex:durableId="5166AA7F" w16cex:dateUtc="2026-09-29T23:35:00Z"/>
+  <w16cex:commentExtensible w16cex:durableId="36C24F61" w16cex:dateUtc="2026-09-29T23:35:00Z"/>
   <w16cex:commentExtensible w16cex:durableId="0B4147B4" w16cex:dateUtc="2026-09-29T20:00:00Z"/>
+  <w16cex:commentExtensible w16cex:durableId="3228CF5C" w16cex:dateUtc="2026-09-29T23:36:00Z"/>
+  <w16cex:commentExtensible w16cex:durableId="2907C742" w16cex:dateUtc="2026-09-29T23:38:00Z"/>
 </w16cex:commentsExtensible>
 </file>
 
 <file path=word/commentsIds.xml><?xml version="1.0" encoding="utf-8"?>
 <w16cid:commentsIds xmlns:wpc="http://schemas.microsoft.com/office/word/2010/wordprocessingCanvas" xmlns:cx="http://schemas.microsoft.com/office/drawing/2014/chartex" xmlns:cx1="http://schemas.microsoft.com/office/drawing/2015/9/8/chartex" xmlns:cx2="http://schemas.microsoft.com/office/drawing/2015/10/21/chartex" xmlns:cx3="http://schemas.microsoft.com/office/drawing/2016/5/9/chartex" xmlns:cx4="http://schemas.microsoft.com/office/drawing/2016/5/10/chartex" xmlns:cx5="http://schemas.microsoft.com/office/drawing/2016/5/11/chartex" xmlns:cx6="http://schemas.microsoft.com/office/drawing/2016/5/12/chartex" xmlns:cx7="http://schemas.microsoft.com/office/drawing/2016/5/13/chartex" xmlns:cx8="http://schemas.microsoft.com/office/drawing/2016/5/14/chartex" xmlns:mc="http://schemas.openxmlformats.org/markup-compatibility/2006" xmlns:aink="http://schemas.microsoft.com/office/drawing/2016/ink" xmlns:am3d="http://schemas.microsoft.com/office/drawing/2017/model3d" xmlns:o="urn:schemas-microsoft-com:office:office" xmlns:oel="http://schemas.microsoft.com/office/2019/extlst" xmlns:r="http://schemas.openxmlformats.org/officeDocument/2006/relationships" xmlns:m="http://schemas.openxmlformats.org/officeDocument/2006/math" xmlns:v="urn:schemas-microsoft-com:vml" xmlns:wp14="http://schemas.microsoft.com/office/word/2010/wordprocessingDrawing" xmlns:wp="http://schemas.openxmlformats.org/drawingml/2006/wordprocessingDrawing" xmlns:w10="urn:schemas-microsoft-com:office:word" xmlns:w="http://schemas.openxmlformats.org/wordprocessingml/2006/main" xmlns:w14="http://schemas.microsoft.com/office/word/2010/wordml" xmlns:w15="http://schemas.microsoft.com/office/word/2012/wordml" xmlns:w16cex="http://schemas.microsoft.com/office/word/2018/wordml/cex" xmlns:w16cid="http://schemas.microsoft.com/office/word/2016/wordml/cid" xmlns:w16="http://schemas.microsoft.com/office/word/2018/wordml" xmlns:w16du="http://schemas.microsoft.com/office/word/2023/wordml/word16du" xmlns:w16sdtdh="http://schemas.microsoft.com/office/word/2020/wordml/sdtdatahash" xmlns:w16sdtfl="http://schemas.microsoft.com/office/word/2024/wordml/sdtformatlock" xmlns:w16se="http://schemas.microsoft.com/office/word/2015/wordml/symex" xmlns:wpg="http://schemas.microsoft.com/office/word/2010/wordprocessingGroup" xmlns:wpi="http://schemas.microsoft.com/office/word/2010/wordprocessingInk" xmlns:wne="http://schemas.microsoft.com/office/word/2006/wordml" xmlns:wps="http://schemas.microsoft.com/office/word/2010/wordprocessingShape" mc:Ignorable="w14 w15 w16se w16cid w16 w16cex w16sdtdh w16sdtfl w16du wp14">
+  <w16cid:commentId w16cid:paraId="5368AF56" w16cid:durableId="27AA91E2"/>
+  <w16cid:commentId w16cid:paraId="1B48BC87" w16cid:durableId="5166AA7F"/>
+  <w16cid:commentId w16cid:paraId="0B82BE84" w16cid:durableId="36C24F61"/>
   <w16cid:commentId w16cid:paraId="7808B866" w16cid:durableId="0B4147B4"/>
+  <w16cid:commentId w16cid:paraId="2FC194F8" w16cid:durableId="3228CF5C"/>
+  <w16cid:commentId w16cid:paraId="09AD0B83" w16cid:durableId="2907C742"/>
 </w16cid:commentsIds>
 </file>
 
@@ -1616,6 +1783,9 @@
 
 <file path=word/people.xml><?xml version="1.0" encoding="utf-8"?>
 <w15:people xmlns:wpc="http://schemas.microsoft.com/office/word/2010/wordprocessingCanvas" xmlns:cx="http://schemas.microsoft.com/office/drawing/2014/chartex" xmlns:cx1="http://schemas.microsoft.com/office/drawing/2015/9/8/chartex" xmlns:cx2="http://schemas.microsoft.com/office/drawing/2015/10/21/chartex" xmlns:cx3="http://schemas.microsoft.com/office/drawing/2016/5/9/chartex" xmlns:cx4="http://schemas.microsoft.com/office/drawing/2016/5/10/chartex" xmlns:cx5="http://schemas.microsoft.com/office/drawing/2016/5/11/chartex" xmlns:cx6="http://schemas.microsoft.com/office/drawing/2016/5/12/chartex" xmlns:cx7="http://schemas.microsoft.com/office/drawing/2016/5/13/chartex" xmlns:cx8="http://schemas.microsoft.com/office/drawing/2016/5/14/chartex" xmlns:mc="http://schemas.openxmlformats.org/markup-compatibility/2006" xmlns:aink="http://schemas.microsoft.com/office/drawing/2016/ink" xmlns:am3d="http://schemas.microsoft.com/office/drawing/2017/model3d" xmlns:o="urn:schemas-microsoft-com:office:office" xmlns:oel="http://schemas.microsoft.com/office/2019/extlst" xmlns:r="http://schemas.openxmlformats.org/officeDocument/2006/relationships" xmlns:m="http://schemas.openxmlformats.org/officeDocument/2006/math" xmlns:v="urn:schemas-microsoft-com:vml" xmlns:wp14="http://schemas.microsoft.com/office/word/2010/wordprocessingDrawing" xmlns:wp="http://schemas.openxmlformats.org/drawingml/2006/wordprocessingDrawing" xmlns:w10="urn:schemas-microsoft-com:office:word" xmlns:w="http://schemas.openxmlformats.org/wordprocessingml/2006/main" xmlns:w14="http://schemas.microsoft.com/office/word/2010/wordml" xmlns:w15="http://schemas.microsoft.com/office/word/2012/wordml" xmlns:w16cex="http://schemas.microsoft.com/office/word/2018/wordml/cex" xmlns:w16cid="http://schemas.microsoft.com/office/word/2016/wordml/cid" xmlns:w16="http://schemas.microsoft.com/office/word/2018/wordml" xmlns:w16du="http://schemas.microsoft.com/office/word/2023/wordml/word16du" xmlns:w16sdtdh="http://schemas.microsoft.com/office/word/2020/wordml/sdtdatahash" xmlns:w16sdtfl="http://schemas.microsoft.com/office/word/2024/wordml/sdtformatlock" xmlns:w16se="http://schemas.microsoft.com/office/word/2015/wordml/symex" xmlns:wpg="http://schemas.microsoft.com/office/word/2010/wordprocessingGroup" xmlns:wpi="http://schemas.microsoft.com/office/word/2010/wordprocessingInk" xmlns:wne="http://schemas.microsoft.com/office/word/2006/wordml" xmlns:wps="http://schemas.microsoft.com/office/word/2010/wordprocessingShape" mc:Ignorable="w14 w15 w16se w16cid w16 w16cex w16sdtdh w16sdtfl w16du wp14">
+  <w15:person w15:author="Chris Haritun">
+    <w15:presenceInfo w15:providerId="AD" w15:userId="S::charitun@myseneca.ca::819e8481-384a-41e6-af7b-7bb453c9ce76"/>
+  </w15:person>
   <w15:person w15:author="Nathan Brasse">
     <w15:presenceInfo w15:providerId="AD" w15:userId="S::njbrasse@myseneca.ca::728d4d41-e4ea-4c2d-ac35-f3890535f53e"/>
   </w15:person>

</xml_diff>

<commit_message>
Updated Finance Risk Component
</commit_message>
<xml_diff>
--- a/Riskiness Index/Riskiness-Finances.docx
+++ b/Riskiness Index/Riskiness-Finances.docx
@@ -814,9 +814,118 @@
       <w:r>
         <w:t xml:space="preserve">Stocks and precious metals can be sold quickly but the risk with them is being forced to sell at a loss during a downturn. </w:t>
       </w:r>
+      <w:r>
+        <w:t xml:space="preserve">To combat a worsening economy, it is reasonable to anticipate a cut in interest rates to drive investment, which could also affect longer product plans. </w:t>
+      </w:r>
+      <w:r>
+        <w:t>Since every holding is Canadian</w:t>
+      </w:r>
+      <w:r>
+        <w:t xml:space="preserve">, </w:t>
+      </w:r>
+      <w:r>
+        <w:t xml:space="preserve">any regional or national dip will hit both assets and claims at the same time. </w:t>
+      </w:r>
+      <w:r>
+        <w:t>There is a risk that bank partners could delay or not remit premiums altogether or reinsurers would not be in a position to pay recoveries and bond issuers may default on any dividends they expected to receive</w:t>
+      </w:r>
+      <w:r>
+        <w:t>.</w:t>
+      </w:r>
+    </w:p>
+    <w:p>
+      <w:r>
+        <w:t xml:space="preserve">We are also concerned about where funds are dedicated. </w:t>
+      </w:r>
+      <w:r>
+        <w:t xml:space="preserve">Cyber is </w:t>
+      </w:r>
+      <w:r>
+        <w:t xml:space="preserve">listed as </w:t>
+      </w:r>
+      <w:r>
+        <w:t xml:space="preserve">one of the main risks </w:t>
+      </w:r>
+      <w:r>
+        <w:t xml:space="preserve">the company plans to mitigate against yet has no dedicated cyber-security staff. The current assessment is that </w:t>
+      </w:r>
+      <w:r>
+        <w:t>resources appear disproportionately distributed to the risks th</w:t>
+      </w:r>
+      <w:r>
+        <w:t xml:space="preserve">at the </w:t>
+      </w:r>
+      <w:r>
+        <w:t>company is concerned with</w:t>
+      </w:r>
+      <w:r>
+        <w:t xml:space="preserve">. </w:t>
+      </w:r>
+      <w:r>
+        <w:t xml:space="preserve">On paper, </w:t>
+      </w:r>
+      <w:r>
+        <w:t xml:space="preserve">the company, in its current position and standing, will be </w:t>
+      </w:r>
+      <w:r>
+        <w:t xml:space="preserve">able to treat most financial </w:t>
+      </w:r>
+      <w:r>
+        <w:t>vulnerab</w:t>
+      </w:r>
+      <w:r>
+        <w:t>ilities</w:t>
+      </w:r>
+      <w:r>
+        <w:t xml:space="preserve"> </w:t>
+      </w:r>
+      <w:r>
+        <w:t>in</w:t>
+      </w:r>
+      <w:r>
+        <w:t xml:space="preserve"> a pandemic economy</w:t>
+      </w:r>
+      <w:r>
+        <w:t>, depending critically on how quickly they can move their assets</w:t>
+      </w:r>
+      <w:r>
+        <w:t xml:space="preserve">. </w:t>
+      </w:r>
+    </w:p>
+    <w:p/>
+    <w:p>
+      <w:pPr>
+        <w:pStyle w:val="Heading2"/>
+      </w:pPr>
+      <w:r>
+        <w:t>On the Internal Controls</w:t>
+      </w:r>
+    </w:p>
+    <w:p>
+      <w:r>
+        <w:t xml:space="preserve">ItrustU </w:t>
+      </w:r>
+      <w:r>
+        <w:t xml:space="preserve">currently collects all premiums, processes claims </w:t>
+      </w:r>
+      <w:r>
+        <w:t xml:space="preserve">and </w:t>
+      </w:r>
+      <w:r>
+        <w:t xml:space="preserve">quotes through their website, mobile app and internal systems. </w:t>
+      </w:r>
+      <w:r>
+        <w:t>As a result,</w:t>
+      </w:r>
       <w:commentRangeStart w:id="0"/>
       <w:r>
-        <w:t xml:space="preserve">Common to all insurers is changes to interest rates </w:t>
+        <w:t xml:space="preserve"> they are </w:t>
+      </w:r>
+      <w:r>
+        <w:t>susceptible</w:t>
+      </w:r>
+      <w:r>
+        <w:t xml:space="preserve"> to </w:t>
       </w:r>
       <w:commentRangeEnd w:id="0"/>
       <w:r>
@@ -828,63 +937,20 @@
         <w:commentReference w:id="0"/>
       </w:r>
       <w:r>
-        <w:t>which could affect long-dated life and pension plans. Since every holding is Canadian</w:t>
-      </w:r>
-      <w:r>
-        <w:t xml:space="preserve">, </w:t>
-      </w:r>
-      <w:r>
-        <w:t xml:space="preserve">any regional or national dip will hit both assets and claims at the same time. </w:t>
-      </w:r>
-    </w:p>
-    <w:p>
-      <w:r>
-        <w:t xml:space="preserve">We are also concerned about where funds are dedicated. </w:t>
-      </w:r>
-      <w:r>
-        <w:t xml:space="preserve">Cyber is </w:t>
-      </w:r>
-      <w:r>
-        <w:t xml:space="preserve">listed as </w:t>
-      </w:r>
-      <w:r>
-        <w:t xml:space="preserve">one of the main risks </w:t>
-      </w:r>
-      <w:r>
-        <w:t xml:space="preserve">the company plans to mitigate against yet has no dedicated cyber-security staff. The current assessment is that </w:t>
-      </w:r>
-      <w:r>
-        <w:t>resources appear disproportionately distributed to the risks they company is concerned with</w:t>
-      </w:r>
-      <w:r>
-        <w:t xml:space="preserve">. Paired with the asset mix and liquidity risk, the company, in its current position and standing, will be vulnerable to a pandemic economy. </w:t>
-      </w:r>
-    </w:p>
-    <w:p/>
-    <w:p>
-      <w:pPr>
-        <w:pStyle w:val="Heading2"/>
-      </w:pPr>
-      <w:r>
-        <w:t>On the Internal Controls</w:t>
-      </w:r>
-    </w:p>
-    <w:p>
-      <w:r>
-        <w:t xml:space="preserve">ItrustU </w:t>
-      </w:r>
-      <w:r>
-        <w:t xml:space="preserve">currently collects all premiums, processes claims </w:t>
-      </w:r>
-      <w:r>
-        <w:t xml:space="preserve">and </w:t>
-      </w:r>
-      <w:r>
-        <w:t xml:space="preserve">quotes through their website, mobile app and internal systems. </w:t>
+        <w:t>a litany of cyberattacks that can have significant financial implications</w:t>
+      </w:r>
+      <w:r>
+        <w:t xml:space="preserve">: direct theft through fraudulent claims payouts and payroll diversion; </w:t>
       </w:r>
       <w:commentRangeStart w:id="1"/>
       <w:r>
-        <w:t>This means they are vulnerable to every cyber security vulnerability in the book</w:t>
+        <w:t>ransom</w:t>
+      </w:r>
+      <w:r>
+        <w:t>ware</w:t>
+      </w:r>
+      <w:r>
+        <w:t xml:space="preserve"> </w:t>
       </w:r>
       <w:commentRangeEnd w:id="1"/>
       <w:r>
@@ -896,11 +962,60 @@
         <w:commentReference w:id="1"/>
       </w:r>
       <w:r>
-        <w:t xml:space="preserve">: direct theft through fraudulent claims payouts and payroll diversion; </w:t>
+        <w:t xml:space="preserve">and recovery costs; data loss and </w:t>
+      </w:r>
+      <w:r>
+        <w:t xml:space="preserve">its </w:t>
+      </w:r>
+      <w:r>
+        <w:t>legal costs; regulatory penalties</w:t>
+      </w:r>
+      <w:r>
+        <w:t>; a tech outage would stop premiums collection and claims payment at the same time.</w:t>
+      </w:r>
+      <w:r>
+        <w:t xml:space="preserve"> </w:t>
+      </w:r>
+      <w:r>
+        <w:t xml:space="preserve">Six people currently cover IT and networking for 50 desktops, on-site servers and the internal network. Hosting, backups and security advice are outsourced. A </w:t>
+      </w:r>
+      <w:r>
+        <w:t>six-person</w:t>
+      </w:r>
+      <w:r>
+        <w:t xml:space="preserve"> team likely cannot provide round-the-clock monitoring</w:t>
+      </w:r>
+      <w:r>
+        <w:t xml:space="preserve">. </w:t>
+      </w:r>
+      <w:r>
+        <w:t xml:space="preserve">Control therefore depends on vendors the company does not directly manage. </w:t>
+      </w:r>
+      <w:r>
+        <w:t xml:space="preserve">The switch to remote work during a pandemic increases the chances for attack and decreases the strength of defending it. </w:t>
+      </w:r>
+    </w:p>
+    <w:p/>
+    <w:p>
+      <w:pPr>
+        <w:pStyle w:val="Heading2"/>
+      </w:pPr>
+      <w:r>
+        <w:t>On Liabilities Under Control</w:t>
+      </w:r>
+    </w:p>
+    <w:p>
+      <w:r>
+        <w:t xml:space="preserve">ItrustU writes both Property &amp; Casualty (P&amp;C) and life/pension products. In the industry, reserves are typically the largest liability on the balance sheet. </w:t>
       </w:r>
       <w:commentRangeStart w:id="2"/>
-      <w:r>
-        <w:t xml:space="preserve">ransom </w:t>
+      <w:commentRangeStart w:id="3"/>
+      <w:r>
+        <w:t xml:space="preserve">With one in three Ontario households insured, adverse weather conditions like ice storms or </w:t>
+      </w:r>
+      <w:r>
+        <w:lastRenderedPageBreak/>
+        <w:t>floods will affect a large share of the clients at once</w:t>
       </w:r>
       <w:commentRangeEnd w:id="2"/>
       <w:r>
@@ -911,82 +1026,6 @@
         </w:rPr>
         <w:commentReference w:id="2"/>
       </w:r>
-      <w:r>
-        <w:t xml:space="preserve">and recovery costs; data loss and </w:t>
-      </w:r>
-      <w:r>
-        <w:t xml:space="preserve">its </w:t>
-      </w:r>
-      <w:r>
-        <w:t>legal costs; regulatory penalties</w:t>
-      </w:r>
-      <w:r>
-        <w:t>; a tech outage would stop premiums collection and claims payment at the same time.</w:t>
-      </w:r>
-      <w:r>
-        <w:t xml:space="preserve"> </w:t>
-      </w:r>
-      <w:r>
-        <w:t>Six people currently cover IT and networking for 50 desktops, on-site servers and the internal network. Hosting, backups and security advice are outsourced. A six person team likely cannot provide round-the-clock monitoring</w:t>
-      </w:r>
-      <w:r>
-        <w:t xml:space="preserve">. </w:t>
-      </w:r>
-      <w:r>
-        <w:t xml:space="preserve">Control therefore depends on vendors the company does not directly manage. </w:t>
-      </w:r>
-      <w:r>
-        <w:t xml:space="preserve">The switch to remote work during a pandemic increases the chances for attack and decreases the strength of defending it. </w:t>
-      </w:r>
-      <w:r>
-        <w:t>Also,</w:t>
-      </w:r>
-      <w:r>
-        <w:t xml:space="preserve"> during a pandemic, brokers and bank partners </w:t>
-      </w:r>
-      <w:r>
-        <w:t>could</w:t>
-      </w:r>
-      <w:r>
-        <w:t xml:space="preserve"> delay or not remit premiums altogether, reinsurers will </w:t>
-      </w:r>
-      <w:r>
-        <w:t xml:space="preserve">likely </w:t>
-      </w:r>
-      <w:r>
-        <w:t xml:space="preserve">not be in a position to pay recoveries and </w:t>
-      </w:r>
-      <w:r>
-        <w:t xml:space="preserve">bond issuers may default on any </w:t>
-      </w:r>
-      <w:r>
-        <w:t>dividends they expect</w:t>
-      </w:r>
-      <w:r>
-        <w:t>ed</w:t>
-      </w:r>
-      <w:r>
-        <w:t xml:space="preserve"> to receive. </w:t>
-      </w:r>
-    </w:p>
-    <w:p/>
-    <w:p>
-      <w:pPr>
-        <w:pStyle w:val="Heading2"/>
-      </w:pPr>
-      <w:r>
-        <w:t>On Liabilities Under Control</w:t>
-      </w:r>
-    </w:p>
-    <w:p>
-      <w:r>
-        <w:t xml:space="preserve">ItrustU writes both Property &amp; Casualty (P&amp;C) and life/pension products. In the industry, reserves are typically the largest liability on the balance sheet. </w:t>
-      </w:r>
-      <w:commentRangeStart w:id="3"/>
-      <w:commentRangeStart w:id="4"/>
-      <w:r>
-        <w:t>With one in three Ontario households insured, adverse weather conditions like ice storms or floods will affect a large share of the clients at once</w:t>
-      </w:r>
       <w:commentRangeEnd w:id="3"/>
       <w:r>
         <w:rPr>
@@ -996,24 +1035,17 @@
         </w:rPr>
         <w:commentReference w:id="3"/>
       </w:r>
-      <w:commentRangeEnd w:id="4"/>
-      <w:r>
-        <w:rPr>
-          <w:rStyle w:val="CommentReference"/>
-          <w:sz w:val="24"/>
-          <w:szCs w:val="22"/>
-        </w:rPr>
-        <w:commentReference w:id="4"/>
-      </w:r>
       <w:r>
         <w:t xml:space="preserve">. </w:t>
       </w:r>
       <w:r>
-        <w:t xml:space="preserve">In July 2013, Ontario recorded a record rainfall that insurers coughed up $940m to reimburse—making </w:t>
-      </w:r>
-      <w:r>
-        <w:lastRenderedPageBreak/>
-        <w:t xml:space="preserve">it the most expensive insured natural disaster in Ontario’s history (CTV). </w:t>
+        <w:t>In July 2013, Ontario recorded a record rainfall that insurers coughed up $940m to reimburse—making it the most expensive insured natural disaster in Ontario’s history (C</w:t>
+      </w:r>
+      <w:r>
+        <w:t>BC News, 2014</w:t>
+      </w:r>
+      <w:r>
+        <w:t xml:space="preserve">). </w:t>
       </w:r>
       <w:r>
         <w:t>Given the liquidity issues mentioned above, any reserve or float they’re required to have may not be able to cover paying out large claims. Travel</w:t>
@@ -1028,7 +1060,25 @@
         <w:t>both</w:t>
       </w:r>
       <w:r>
-        <w:t xml:space="preserve"> going to rise at the same time.  Falling interest rates will also increase the value of pension and annuity obligations while reducing investment income; any increase in the value of pension applies both </w:t>
+        <w:t xml:space="preserve"> going to rise at the same time</w:t>
+      </w:r>
+      <w:r>
+        <w:t xml:space="preserve">. </w:t>
+      </w:r>
+      <w:r>
+        <w:t xml:space="preserve">Falling interest rates will also increase the value of pension and annuity obligations while reducing investment income; any increase in the value of pension </w:t>
+      </w:r>
+      <w:r>
+        <w:t xml:space="preserve">will </w:t>
+      </w:r>
+      <w:r>
+        <w:t>appl</w:t>
+      </w:r>
+      <w:r>
+        <w:t xml:space="preserve">y </w:t>
+      </w:r>
+      <w:r>
+        <w:t xml:space="preserve">both </w:t>
       </w:r>
       <w:r>
         <w:t>to the company’s</w:t>
@@ -1042,6 +1092,18 @@
       <w:r>
         <w:t xml:space="preserve">ts own employees. </w:t>
       </w:r>
+      <w:r>
+        <w:t>The key for financial risk management here is to weigh the costs and benefits of liquidation of certain assets for immediate relief (even at a loss) to sustain the company independent of the health of the parent company or government intervention.</w:t>
+      </w:r>
+      <w:r>
+        <w:t xml:space="preserve"> Survival strategies may include taking on further liabilities </w:t>
+      </w:r>
+      <w:r>
+        <w:t>to identify and create pathways for stable cash flow amid rising claims.</w:t>
+      </w:r>
+      <w:r>
+        <w:t xml:space="preserve"> </w:t>
+      </w:r>
     </w:p>
     <w:p/>
     <w:p>
@@ -1057,29 +1119,25 @@
         <w:t xml:space="preserve">ItrustU’s clearest strength is the availability of funds. Backing from Tiva and a steady flow of premiums make a decrease in funding unlikely, even under pandemic conditions. The greatest exposures lie in internal controls and liabilities under control. Internal controls carry the most likely losses, because a thin in-house IT department and a reliance on third-party vendors leave the door open for insider fraud and/or cyber-disasters. </w:t>
       </w:r>
       <w:r>
-        <w:t xml:space="preserve">Liabilities can result in the most losses overall as rising claims and a fall in interest rates can significantly strain reserves. The lack of infrastructure in these areas suggest that further investment in people, systems and vendor oversight would reduce financial exposure as well. </w:t>
-      </w:r>
-      <w:commentRangeStart w:id="5"/>
-      <w:r>
-        <w:t>Does that mean that we could only reduce as much risk as our financ</w:t>
-      </w:r>
-      <w:r>
-        <w:t>ial position</w:t>
-      </w:r>
-      <w:r>
-        <w:t xml:space="preserve"> allows?</w:t>
-      </w:r>
-      <w:r>
-        <w:t>??</w:t>
-      </w:r>
-      <w:commentRangeEnd w:id="5"/>
-      <w:r>
-        <w:rPr>
-          <w:rStyle w:val="CommentReference"/>
-          <w:sz w:val="24"/>
-          <w:szCs w:val="22"/>
-        </w:rPr>
-        <w:commentReference w:id="5"/>
+        <w:t xml:space="preserve">Liabilities can result in the most losses overall as rising claims and a fall in interest rates can significantly strain reserves. </w:t>
+      </w:r>
+      <w:r>
+        <w:t>The lack of infrastructure in these areas suggest that further investment in people, systems and vendor oversight would reduce financial exposure</w:t>
+      </w:r>
+      <w:r>
+        <w:t xml:space="preserve"> during the pandemic and in the long run</w:t>
+      </w:r>
+      <w:r>
+        <w:t>.</w:t>
+      </w:r>
+      <w:r>
+        <w:t xml:space="preserve"> Risk strategy will need to focus on which risks need to be tolerated and which can be treated or terminated, given the availability of funds.</w:t>
+      </w:r>
+      <w:r>
+        <w:t xml:space="preserve"> </w:t>
+      </w:r>
+      <w:r>
+        <w:t xml:space="preserve"> </w:t>
       </w:r>
     </w:p>
     <w:p/>
@@ -1097,26 +1155,24 @@
         </w:numPr>
       </w:pPr>
       <w:r>
-        <w:t>Saunders</w:t>
-      </w:r>
-    </w:p>
-    <w:p>
-      <w:pPr>
-        <w:pStyle w:val="ListParagraph"/>
-        <w:numPr>
-          <w:ilvl w:val="0"/>
-          <w:numId w:val="5"/>
-        </w:numPr>
-      </w:pPr>
-      <w:r>
-        <w:t xml:space="preserve">CTV </w:t>
+        <w:t xml:space="preserve">CBC News. (2014, January 20). </w:t>
+      </w:r>
+      <w:r>
+        <w:rPr>
+          <w:i/>
+          <w:iCs/>
+        </w:rPr>
+        <w:t>Extreme weather cost Canada record $3.2B, insurers say</w:t>
+      </w:r>
+      <w:r>
+        <w:t xml:space="preserve">. </w:t>
       </w:r>
       <w:hyperlink r:id="rId9" w:history="1">
         <w:r>
           <w:rPr>
             <w:rStyle w:val="Hyperlink"/>
           </w:rPr>
-          <w:t>Extreme weather cost Canada record $3.2B, insurers say</w:t>
+          <w:t>https://www.cbc.ca/news/business/extreme-weather-cost-canada-record-3-2b-insurers-say-1.2503659</w:t>
         </w:r>
       </w:hyperlink>
     </w:p>
@@ -1132,7 +1188,7 @@
 
 <file path=word/comments.xml><?xml version="1.0" encoding="utf-8"?>
 <w:comments xmlns:wpc="http://schemas.microsoft.com/office/word/2010/wordprocessingCanvas" xmlns:cx="http://schemas.microsoft.com/office/drawing/2014/chartex" xmlns:cx1="http://schemas.microsoft.com/office/drawing/2015/9/8/chartex" xmlns:cx2="http://schemas.microsoft.com/office/drawing/2015/10/21/chartex" xmlns:cx3="http://schemas.microsoft.com/office/drawing/2016/5/9/chartex" xmlns:cx4="http://schemas.microsoft.com/office/drawing/2016/5/10/chartex" xmlns:cx5="http://schemas.microsoft.com/office/drawing/2016/5/11/chartex" xmlns:cx6="http://schemas.microsoft.com/office/drawing/2016/5/12/chartex" xmlns:cx7="http://schemas.microsoft.com/office/drawing/2016/5/13/chartex" xmlns:cx8="http://schemas.microsoft.com/office/drawing/2016/5/14/chartex" xmlns:mc="http://schemas.openxmlformats.org/markup-compatibility/2006" xmlns:aink="http://schemas.microsoft.com/office/drawing/2016/ink" xmlns:am3d="http://schemas.microsoft.com/office/drawing/2017/model3d" xmlns:o="urn:schemas-microsoft-com:office:office" xmlns:oel="http://schemas.microsoft.com/office/2019/extlst" xmlns:r="http://schemas.openxmlformats.org/officeDocument/2006/relationships" xmlns:m="http://schemas.openxmlformats.org/officeDocument/2006/math" xmlns:v="urn:schemas-microsoft-com:vml" xmlns:wp14="http://schemas.microsoft.com/office/word/2010/wordprocessingDrawing" xmlns:wp="http://schemas.openxmlformats.org/drawingml/2006/wordprocessingDrawing" xmlns:w10="urn:schemas-microsoft-com:office:word" xmlns:w="http://schemas.openxmlformats.org/wordprocessingml/2006/main" xmlns:w14="http://schemas.microsoft.com/office/word/2010/wordml" xmlns:w15="http://schemas.microsoft.com/office/word/2012/wordml" xmlns:w16cex="http://schemas.microsoft.com/office/word/2018/wordml/cex" xmlns:w16cid="http://schemas.microsoft.com/office/word/2016/wordml/cid" xmlns:w16="http://schemas.microsoft.com/office/word/2018/wordml" xmlns:w16du="http://schemas.microsoft.com/office/word/2023/wordml/word16du" xmlns:w16sdtdh="http://schemas.microsoft.com/office/word/2020/wordml/sdtdatahash" xmlns:w16sdtfl="http://schemas.microsoft.com/office/word/2024/wordml/sdtformatlock" xmlns:w16se="http://schemas.microsoft.com/office/word/2015/wordml/symex" xmlns:wpg="http://schemas.microsoft.com/office/word/2010/wordprocessingGroup" xmlns:wpi="http://schemas.microsoft.com/office/word/2010/wordprocessingInk" xmlns:wne="http://schemas.microsoft.com/office/word/2006/wordml" xmlns:wps="http://schemas.microsoft.com/office/word/2010/wordprocessingShape" mc:Ignorable="w14 w15 w16se w16cid w16 w16cex w16sdtdh w16sdtfl w16du wp14">
-  <w:comment w:id="0" w:author="Chris Haritun" w:date="2026-09-29T19:34:00Z" w:initials="CH">
+  <w:comment w:id="0" w:author="Chris Haritun" w:date="2026-09-29T19:35:00Z" w:initials="CH">
     <w:p>
       <w:pPr>
         <w:pStyle w:val="CommentText"/>
@@ -1144,7 +1200,7 @@
         <w:annotationRef/>
       </w:r>
       <w:r>
-        <w:t xml:space="preserve">Can this be altered? The fear entering the pandemic was that shutting down businesses would create a recessing which generally sparks a decline in interest rates to drive investment. </w:t>
+        <w:t xml:space="preserve">Language is too informal. </w:t>
       </w:r>
     </w:p>
   </w:comment>
@@ -1160,11 +1216,11 @@
         <w:annotationRef/>
       </w:r>
       <w:r>
-        <w:t xml:space="preserve">Language is too informal. </w:t>
+        <w:t>ransomware</w:t>
       </w:r>
     </w:p>
   </w:comment>
-  <w:comment w:id="2" w:author="Chris Haritun" w:date="2026-09-29T19:35:00Z" w:initials="CH">
+  <w:comment w:id="2" w:author="Nathan Brasse" w:date="2026-09-29T16:00:00Z" w:initials="NB">
     <w:p>
       <w:pPr>
         <w:pStyle w:val="CommentText"/>
@@ -1176,11 +1232,11 @@
         <w:annotationRef/>
       </w:r>
       <w:r>
-        <w:t>ransomware</w:t>
+        <w:t>How many homes are in Ontario?</w:t>
       </w:r>
     </w:p>
   </w:comment>
-  <w:comment w:id="3" w:author="Nathan Brasse" w:date="2026-09-29T16:00:00Z" w:initials="NB">
+  <w:comment w:id="3" w:author="Chris Haritun" w:date="2026-09-29T19:36:00Z" w:initials="CH">
     <w:p>
       <w:pPr>
         <w:pStyle w:val="CommentText"/>
@@ -1192,46 +1248,7 @@
         <w:annotationRef/>
       </w:r>
       <w:r>
-        <w:t>How many homes are in Ontario?</w:t>
-      </w:r>
-    </w:p>
-  </w:comment>
-  <w:comment w:id="4" w:author="Chris Haritun" w:date="2026-09-29T19:36:00Z" w:initials="CH">
-    <w:p>
-      <w:pPr>
-        <w:pStyle w:val="CommentText"/>
-      </w:pPr>
-      <w:r>
-        <w:rPr>
-          <w:rStyle w:val="CommentReference"/>
-        </w:rPr>
-        <w:annotationRef/>
-      </w:r>
-      <w:r>
         <w:t>5.8 million</w:t>
-      </w:r>
-    </w:p>
-  </w:comment>
-  <w:comment w:id="5" w:author="Chris Haritun" w:date="2026-09-29T19:38:00Z" w:initials="CH">
-    <w:p>
-      <w:pPr>
-        <w:pStyle w:val="CommentText"/>
-      </w:pPr>
-      <w:r>
-        <w:rPr>
-          <w:rStyle w:val="CommentReference"/>
-        </w:rPr>
-        <w:annotationRef/>
-      </w:r>
-      <w:r>
-        <w:t xml:space="preserve">I would change this. </w:t>
-      </w:r>
-      <w:r>
-        <w:br/>
-      </w:r>
-      <w:r>
-        <w:br/>
-        <w:t xml:space="preserve">Talk about how our risk strategy needs to be developed based on available funds. We will need to carefully measure which risk warrant treatment or termination, and which we will be required to tolerate. </w:t>
       </w:r>
     </w:p>
   </w:comment>
@@ -1240,34 +1257,40 @@
 
 <file path=word/commentsExtended.xml><?xml version="1.0" encoding="utf-8"?>
 <w15:commentsEx xmlns:wpc="http://schemas.microsoft.com/office/word/2010/wordprocessingCanvas" xmlns:cx="http://schemas.microsoft.com/office/drawing/2014/chartex" xmlns:cx1="http://schemas.microsoft.com/office/drawing/2015/9/8/chartex" xmlns:cx2="http://schemas.microsoft.com/office/drawing/2015/10/21/chartex" xmlns:cx3="http://schemas.microsoft.com/office/drawing/2016/5/9/chartex" xmlns:cx4="http://schemas.microsoft.com/office/drawing/2016/5/10/chartex" xmlns:cx5="http://schemas.microsoft.com/office/drawing/2016/5/11/chartex" xmlns:cx6="http://schemas.microsoft.com/office/drawing/2016/5/12/chartex" xmlns:cx7="http://schemas.microsoft.com/office/drawing/2016/5/13/chartex" xmlns:cx8="http://schemas.microsoft.com/office/drawing/2016/5/14/chartex" xmlns:mc="http://schemas.openxmlformats.org/markup-compatibility/2006" xmlns:aink="http://schemas.microsoft.com/office/drawing/2016/ink" xmlns:am3d="http://schemas.microsoft.com/office/drawing/2017/model3d" xmlns:o="urn:schemas-microsoft-com:office:office" xmlns:oel="http://schemas.microsoft.com/office/2019/extlst" xmlns:r="http://schemas.openxmlformats.org/officeDocument/2006/relationships" xmlns:m="http://schemas.openxmlformats.org/officeDocument/2006/math" xmlns:v="urn:schemas-microsoft-com:vml" xmlns:wp14="http://schemas.microsoft.com/office/word/2010/wordprocessingDrawing" xmlns:wp="http://schemas.openxmlformats.org/drawingml/2006/wordprocessingDrawing" xmlns:w10="urn:schemas-microsoft-com:office:word" xmlns:w="http://schemas.openxmlformats.org/wordprocessingml/2006/main" xmlns:w14="http://schemas.microsoft.com/office/word/2010/wordml" xmlns:w15="http://schemas.microsoft.com/office/word/2012/wordml" xmlns:w16cex="http://schemas.microsoft.com/office/word/2018/wordml/cex" xmlns:w16cid="http://schemas.microsoft.com/office/word/2016/wordml/cid" xmlns:w16="http://schemas.microsoft.com/office/word/2018/wordml" xmlns:w16du="http://schemas.microsoft.com/office/word/2023/wordml/word16du" xmlns:w16sdtdh="http://schemas.microsoft.com/office/word/2020/wordml/sdtdatahash" xmlns:w16sdtfl="http://schemas.microsoft.com/office/word/2024/wordml/sdtformatlock" xmlns:w16se="http://schemas.microsoft.com/office/word/2015/wordml/symex" xmlns:wpg="http://schemas.microsoft.com/office/word/2010/wordprocessingGroup" xmlns:wpi="http://schemas.microsoft.com/office/word/2010/wordprocessingInk" xmlns:wne="http://schemas.microsoft.com/office/word/2006/wordml" xmlns:wps="http://schemas.microsoft.com/office/word/2010/wordprocessingShape" mc:Ignorable="w14 w15 w16se w16cid w16 w16cex w16sdtdh w16sdtfl w16du wp14">
-  <w15:commentEx w15:paraId="5368AF56" w15:done="0"/>
-  <w15:commentEx w15:paraId="1B48BC87" w15:done="0"/>
-  <w15:commentEx w15:paraId="0B82BE84" w15:done="0"/>
-  <w15:commentEx w15:paraId="7808B866" w15:done="0"/>
-  <w15:commentEx w15:paraId="2FC194F8" w15:paraIdParent="7808B866" w15:done="0"/>
-  <w15:commentEx w15:paraId="09AD0B83" w15:done="0"/>
+  <w15:commentEx w15:paraId="1B48BC87" w15:done="1"/>
+  <w15:commentEx w15:paraId="0B82BE84" w15:done="1"/>
+  <w15:commentEx w15:paraId="7808B866" w15:done="1"/>
+  <w15:commentEx w15:paraId="2FC194F8" w15:paraIdParent="7808B866" w15:done="1"/>
 </w15:commentsEx>
 </file>
 
 <file path=word/commentsExtensible.xml><?xml version="1.0" encoding="utf-8"?>
 <w16cex:commentsExtensible xmlns:wpc="http://schemas.microsoft.com/office/word/2010/wordprocessingCanvas" xmlns:cx="http://schemas.microsoft.com/office/drawing/2014/chartex" xmlns:cx1="http://schemas.microsoft.com/office/drawing/2015/9/8/chartex" xmlns:cx2="http://schemas.microsoft.com/office/drawing/2015/10/21/chartex" xmlns:cx3="http://schemas.microsoft.com/office/drawing/2016/5/9/chartex" xmlns:cx4="http://schemas.microsoft.com/office/drawing/2016/5/10/chartex" xmlns:cx5="http://schemas.microsoft.com/office/drawing/2016/5/11/chartex" xmlns:cx6="http://schemas.microsoft.com/office/drawing/2016/5/12/chartex" xmlns:cx7="http://schemas.microsoft.com/office/drawing/2016/5/13/chartex" xmlns:cx8="http://schemas.microsoft.com/office/drawing/2016/5/14/chartex" xmlns:cr="http://schemas.microsoft.com/office/comments/2020/reactions" xmlns:mc="http://schemas.openxmlformats.org/markup-compatibility/2006" xmlns:aink="http://schemas.microsoft.com/office/drawing/2016/ink" xmlns:am3d="http://schemas.microsoft.com/office/drawing/2017/model3d" xmlns:o="urn:schemas-microsoft-com:office:office" xmlns:oel="http://schemas.microsoft.com/office/2019/extlst" xmlns:r="http://schemas.openxmlformats.org/officeDocument/2006/relationships" xmlns:m="http://schemas.openxmlformats.org/officeDocument/2006/math" xmlns:v="urn:schemas-microsoft-com:vml" xmlns:wp14="http://schemas.microsoft.com/office/word/2010/wordprocessingDrawing" xmlns:wp="http://schemas.openxmlformats.org/drawingml/2006/wordprocessingDrawing" xmlns:w10="urn:schemas-microsoft-com:office:word" xmlns:w="http://schemas.openxmlformats.org/wordprocessingml/2006/main" xmlns:w14="http://schemas.microsoft.com/office/word/2010/wordml" xmlns:w15="http://schemas.microsoft.com/office/word/2012/wordml" xmlns:w16cex="http://schemas.microsoft.com/office/word/2018/wordml/cex" xmlns:w16cid="http://schemas.microsoft.com/office/word/2016/wordml/cid" xmlns:w16="http://schemas.microsoft.com/office/word/2018/wordml" xmlns:w16du="http://schemas.microsoft.com/office/word/2023/wordml/word16du" xmlns:w16sdtdh="http://schemas.microsoft.com/office/word/2020/wordml/sdtdatahash" xmlns:w16sdtfl="http://schemas.microsoft.com/office/word/2024/wordml/sdtformatlock" xmlns:w16se="http://schemas.microsoft.com/office/word/2015/wordml/symex" xmlns:wpg="http://schemas.microsoft.com/office/word/2010/wordprocessingGroup" xmlns:wpi="http://schemas.microsoft.com/office/word/2010/wordprocessingInk" xmlns:wne="http://schemas.microsoft.com/office/word/2006/wordml" xmlns:wps="http://schemas.microsoft.com/office/word/2010/wordprocessingShape" mc:Ignorable="w14 w15 w16se w16cid w16 w16cex w16sdtdh w16sdtfl cr w16du wp14">
-  <w16cex:commentExtensible w16cex:durableId="27AA91E2" w16cex:dateUtc="2026-09-29T23:34:00Z"/>
   <w16cex:commentExtensible w16cex:durableId="5166AA7F" w16cex:dateUtc="2026-09-29T23:35:00Z"/>
-  <w16cex:commentExtensible w16cex:durableId="36C24F61" w16cex:dateUtc="2026-09-29T23:35:00Z"/>
+  <w16cex:commentExtensible w16cex:durableId="36C24F61" w16cex:dateUtc="2026-09-29T23:35:00Z">
+    <w16cex:extLst>
+      <w16:ext w16:uri="{CE6994B0-6A32-4C9F-8C6B-6E91EDA988CE}">
+        <cr:reactions xmlns:cr="http://schemas.microsoft.com/office/comments/2020/reactions">
+          <cr:reaction reactionType="1">
+            <cr:reactionInfo dateUtc="2026-09-30T16:17:29Z">
+              <cr:user userId="S::njbrasse@myseneca.ca::728d4d41-e4ea-4c2d-ac35-f3890535f53e" userProvider="AD" userName="Nathan Brasse"/>
+            </cr:reactionInfo>
+          </cr:reaction>
+        </cr:reactions>
+      </w16:ext>
+    </w16cex:extLst>
+  </w16cex:commentExtensible>
   <w16cex:commentExtensible w16cex:durableId="0B4147B4" w16cex:dateUtc="2026-09-29T20:00:00Z"/>
   <w16cex:commentExtensible w16cex:durableId="3228CF5C" w16cex:dateUtc="2026-09-29T23:36:00Z"/>
-  <w16cex:commentExtensible w16cex:durableId="2907C742" w16cex:dateUtc="2026-09-29T23:38:00Z"/>
 </w16cex:commentsExtensible>
 </file>
 
 <file path=word/commentsIds.xml><?xml version="1.0" encoding="utf-8"?>
 <w16cid:commentsIds xmlns:wpc="http://schemas.microsoft.com/office/word/2010/wordprocessingCanvas" xmlns:cx="http://schemas.microsoft.com/office/drawing/2014/chartex" xmlns:cx1="http://schemas.microsoft.com/office/drawing/2015/9/8/chartex" xmlns:cx2="http://schemas.microsoft.com/office/drawing/2015/10/21/chartex" xmlns:cx3="http://schemas.microsoft.com/office/drawing/2016/5/9/chartex" xmlns:cx4="http://schemas.microsoft.com/office/drawing/2016/5/10/chartex" xmlns:cx5="http://schemas.microsoft.com/office/drawing/2016/5/11/chartex" xmlns:cx6="http://schemas.microsoft.com/office/drawing/2016/5/12/chartex" xmlns:cx7="http://schemas.microsoft.com/office/drawing/2016/5/13/chartex" xmlns:cx8="http://schemas.microsoft.com/office/drawing/2016/5/14/chartex" xmlns:mc="http://schemas.openxmlformats.org/markup-compatibility/2006" xmlns:aink="http://schemas.microsoft.com/office/drawing/2016/ink" xmlns:am3d="http://schemas.microsoft.com/office/drawing/2017/model3d" xmlns:o="urn:schemas-microsoft-com:office:office" xmlns:oel="http://schemas.microsoft.com/office/2019/extlst" xmlns:r="http://schemas.openxmlformats.org/officeDocument/2006/relationships" xmlns:m="http://schemas.openxmlformats.org/officeDocument/2006/math" xmlns:v="urn:schemas-microsoft-com:vml" xmlns:wp14="http://schemas.microsoft.com/office/word/2010/wordprocessingDrawing" xmlns:wp="http://schemas.openxmlformats.org/drawingml/2006/wordprocessingDrawing" xmlns:w10="urn:schemas-microsoft-com:office:word" xmlns:w="http://schemas.openxmlformats.org/wordprocessingml/2006/main" xmlns:w14="http://schemas.microsoft.com/office/word/2010/wordml" xmlns:w15="http://schemas.microsoft.com/office/word/2012/wordml" xmlns:w16cex="http://schemas.microsoft.com/office/word/2018/wordml/cex" xmlns:w16cid="http://schemas.microsoft.com/office/word/2016/wordml/cid" xmlns:w16="http://schemas.microsoft.com/office/word/2018/wordml" xmlns:w16du="http://schemas.microsoft.com/office/word/2023/wordml/word16du" xmlns:w16sdtdh="http://schemas.microsoft.com/office/word/2020/wordml/sdtdatahash" xmlns:w16sdtfl="http://schemas.microsoft.com/office/word/2024/wordml/sdtformatlock" xmlns:w16se="http://schemas.microsoft.com/office/word/2015/wordml/symex" xmlns:wpg="http://schemas.microsoft.com/office/word/2010/wordprocessingGroup" xmlns:wpi="http://schemas.microsoft.com/office/word/2010/wordprocessingInk" xmlns:wne="http://schemas.microsoft.com/office/word/2006/wordml" xmlns:wps="http://schemas.microsoft.com/office/word/2010/wordprocessingShape" mc:Ignorable="w14 w15 w16se w16cid w16 w16cex w16sdtdh w16sdtfl w16du wp14">
-  <w16cid:commentId w16cid:paraId="5368AF56" w16cid:durableId="27AA91E2"/>
   <w16cid:commentId w16cid:paraId="1B48BC87" w16cid:durableId="5166AA7F"/>
   <w16cid:commentId w16cid:paraId="0B82BE84" w16cid:durableId="36C24F61"/>
   <w16cid:commentId w16cid:paraId="7808B866" w16cid:durableId="0B4147B4"/>
   <w16cid:commentId w16cid:paraId="2FC194F8" w16cid:durableId="3228CF5C"/>
-  <w16cid:commentId w16cid:paraId="09AD0B83" w16cid:durableId="2907C742"/>
 </w16cid:commentsIds>
 </file>
 
@@ -2395,7 +2418,6 @@
   <w:style w:type="character" w:default="1" w:styleId="DefaultParagraphFont">
     <w:name w:val="Default Paragraph Font"/>
     <w:uiPriority w:val="1"/>
-    <w:semiHidden/>
     <w:unhideWhenUsed/>
   </w:style>
   <w:style w:type="table" w:default="1" w:styleId="TableNormal">

</xml_diff>